<commit_message>
Added Surety Ins company to service line.
</commit_message>
<xml_diff>
--- a/resources/Templates/Failure_To_Appear_Template.docx
+++ b/resources/Templates/Failure_To_Appear_Template.docx
@@ -256,8 +256,18 @@
           <w:sz w:val="20"/>
           <w:szCs w:val="20"/>
         </w:rPr>
-        <w:t>{{ case_number</w:t>
-      </w:r>
+        <w:t xml:space="preserve">{{ </w:t>
+      </w:r>
+      <w:proofErr w:type="spellStart"/>
+      <w:r>
+        <w:rPr>
+          <w:rFonts w:ascii="Palatino Linotype" w:hAnsi="Palatino Linotype"/>
+          <w:sz w:val="20"/>
+          <w:szCs w:val="20"/>
+        </w:rPr>
+        <w:t>case_number</w:t>
+      </w:r>
+      <w:proofErr w:type="spellEnd"/>
       <w:r>
         <w:rPr>
           <w:rFonts w:ascii="Palatino Linotype" w:hAnsi="Palatino Linotype"/>
@@ -319,15 +329,33 @@
           <w:sz w:val="20"/>
           <w:szCs w:val="20"/>
         </w:rPr>
-        <w:t>{{ defendant.</w:t>
-      </w:r>
-      <w:r>
-        <w:rPr>
-          <w:rFonts w:ascii="Palatino Linotype" w:hAnsi="Palatino Linotype"/>
-          <w:sz w:val="20"/>
-          <w:szCs w:val="20"/>
-        </w:rPr>
-        <w:t>first_name }}</w:t>
+        <w:t xml:space="preserve">{{ </w:t>
+      </w:r>
+      <w:proofErr w:type="spellStart"/>
+      <w:r>
+        <w:rPr>
+          <w:rFonts w:ascii="Palatino Linotype" w:hAnsi="Palatino Linotype"/>
+          <w:sz w:val="20"/>
+          <w:szCs w:val="20"/>
+        </w:rPr>
+        <w:t>defendant.</w:t>
+      </w:r>
+      <w:r>
+        <w:rPr>
+          <w:rFonts w:ascii="Palatino Linotype" w:hAnsi="Palatino Linotype"/>
+          <w:sz w:val="20"/>
+          <w:szCs w:val="20"/>
+        </w:rPr>
+        <w:t>first_name</w:t>
+      </w:r>
+      <w:proofErr w:type="spellEnd"/>
+      <w:r>
+        <w:rPr>
+          <w:rFonts w:ascii="Palatino Linotype" w:hAnsi="Palatino Linotype"/>
+          <w:sz w:val="20"/>
+          <w:szCs w:val="20"/>
+        </w:rPr>
+        <w:t xml:space="preserve"> }}</w:t>
       </w:r>
       <w:r>
         <w:rPr>
@@ -343,7 +371,16 @@
           <w:sz w:val="20"/>
           <w:szCs w:val="20"/>
         </w:rPr>
-        <w:t>{{ defendant.</w:t>
+        <w:t xml:space="preserve">{{ </w:t>
+      </w:r>
+      <w:proofErr w:type="spellStart"/>
+      <w:r>
+        <w:rPr>
+          <w:rFonts w:ascii="Palatino Linotype" w:hAnsi="Palatino Linotype"/>
+          <w:sz w:val="20"/>
+          <w:szCs w:val="20"/>
+        </w:rPr>
+        <w:t>defendant.</w:t>
       </w:r>
       <w:r>
         <w:rPr>
@@ -359,7 +396,16 @@
           <w:sz w:val="20"/>
           <w:szCs w:val="20"/>
         </w:rPr>
-        <w:t>name }}</w:t>
+        <w:t>name</w:t>
+      </w:r>
+      <w:proofErr w:type="spellEnd"/>
+      <w:r>
+        <w:rPr>
+          <w:rFonts w:ascii="Palatino Linotype" w:hAnsi="Palatino Linotype"/>
+          <w:sz w:val="20"/>
+          <w:szCs w:val="20"/>
+        </w:rPr>
+        <w:t xml:space="preserve"> }}</w:t>
       </w:r>
       <w:r>
         <w:rPr>
@@ -498,7 +544,17 @@
           <w:sz w:val="20"/>
           <w:szCs w:val="20"/>
         </w:rPr>
-        <w:t>% if judicial_officer.officer_</w:t>
+        <w:t xml:space="preserve">% if </w:t>
+      </w:r>
+      <w:proofErr w:type="spellStart"/>
+      <w:r>
+        <w:rPr>
+          <w:rFonts w:ascii="Palatino Linotype" w:hAnsi="Palatino Linotype"/>
+          <w:bCs/>
+          <w:sz w:val="20"/>
+          <w:szCs w:val="20"/>
+        </w:rPr>
+        <w:t>judicial_officer.officer_</w:t>
       </w:r>
       <w:r>
         <w:rPr>
@@ -509,6 +565,7 @@
         </w:rPr>
         <w:t>type</w:t>
       </w:r>
+      <w:proofErr w:type="spellEnd"/>
       <w:r>
         <w:rPr>
           <w:rFonts w:ascii="Palatino Linotype" w:hAnsi="Palatino Linotype"/>
@@ -627,15 +684,51 @@
           <w:sz w:val="20"/>
           <w:szCs w:val="20"/>
         </w:rPr>
-        <w:t>{% elif judicial_officer.officer_</w:t>
-      </w:r>
-      <w:r>
-        <w:rPr>
-          <w:rFonts w:ascii="Palatino Linotype" w:hAnsi="Palatino Linotype"/>
-          <w:sz w:val="20"/>
-          <w:szCs w:val="20"/>
-        </w:rPr>
-        <w:t>type == ‘Judge’ %}</w:t>
+        <w:t xml:space="preserve">{% </w:t>
+      </w:r>
+      <w:proofErr w:type="spellStart"/>
+      <w:r>
+        <w:rPr>
+          <w:rFonts w:ascii="Palatino Linotype" w:hAnsi="Palatino Linotype"/>
+          <w:sz w:val="20"/>
+          <w:szCs w:val="20"/>
+        </w:rPr>
+        <w:t>elif</w:t>
+      </w:r>
+      <w:proofErr w:type="spellEnd"/>
+      <w:r>
+        <w:rPr>
+          <w:rFonts w:ascii="Palatino Linotype" w:hAnsi="Palatino Linotype"/>
+          <w:sz w:val="20"/>
+          <w:szCs w:val="20"/>
+        </w:rPr>
+        <w:t xml:space="preserve"> </w:t>
+      </w:r>
+      <w:proofErr w:type="spellStart"/>
+      <w:r>
+        <w:rPr>
+          <w:rFonts w:ascii="Palatino Linotype" w:hAnsi="Palatino Linotype"/>
+          <w:sz w:val="20"/>
+          <w:szCs w:val="20"/>
+        </w:rPr>
+        <w:t>judicial_officer.officer_</w:t>
+      </w:r>
+      <w:r>
+        <w:rPr>
+          <w:rFonts w:ascii="Palatino Linotype" w:hAnsi="Palatino Linotype"/>
+          <w:sz w:val="20"/>
+          <w:szCs w:val="20"/>
+        </w:rPr>
+        <w:t>type</w:t>
+      </w:r>
+      <w:proofErr w:type="spellEnd"/>
+      <w:r>
+        <w:rPr>
+          <w:rFonts w:ascii="Palatino Linotype" w:hAnsi="Palatino Linotype"/>
+          <w:sz w:val="20"/>
+          <w:szCs w:val="20"/>
+        </w:rPr>
+        <w:t xml:space="preserve"> == ‘Judge’ %}</w:t>
       </w:r>
     </w:p>
     <w:p>
@@ -809,7 +902,25 @@
           <w:sz w:val="20"/>
           <w:szCs w:val="20"/>
         </w:rPr>
-        <w:t>for {{ appearance_reason }}</w:t>
+        <w:t xml:space="preserve">for {{ </w:t>
+      </w:r>
+      <w:proofErr w:type="spellStart"/>
+      <w:r>
+        <w:rPr>
+          <w:rFonts w:ascii="Palatino Linotype" w:hAnsi="Palatino Linotype"/>
+          <w:sz w:val="20"/>
+          <w:szCs w:val="20"/>
+        </w:rPr>
+        <w:t>appearance_reason</w:t>
+      </w:r>
+      <w:proofErr w:type="spellEnd"/>
+      <w:r>
+        <w:rPr>
+          <w:rFonts w:ascii="Palatino Linotype" w:hAnsi="Palatino Linotype"/>
+          <w:sz w:val="20"/>
+          <w:szCs w:val="20"/>
+        </w:rPr>
+        <w:t xml:space="preserve"> }}</w:t>
       </w:r>
       <w:r>
         <w:rPr>
@@ -825,7 +936,25 @@
           <w:sz w:val="20"/>
           <w:szCs w:val="20"/>
         </w:rPr>
-        <w:t>on {{ plea_trial_date }}</w:t>
+        <w:t xml:space="preserve">on {{ </w:t>
+      </w:r>
+      <w:proofErr w:type="spellStart"/>
+      <w:r>
+        <w:rPr>
+          <w:rFonts w:ascii="Palatino Linotype" w:hAnsi="Palatino Linotype"/>
+          <w:sz w:val="20"/>
+          <w:szCs w:val="20"/>
+        </w:rPr>
+        <w:t>plea_trial_date</w:t>
+      </w:r>
+      <w:proofErr w:type="spellEnd"/>
+      <w:r>
+        <w:rPr>
+          <w:rFonts w:ascii="Palatino Linotype" w:hAnsi="Palatino Linotype"/>
+          <w:sz w:val="20"/>
+          <w:szCs w:val="20"/>
+        </w:rPr>
+        <w:t xml:space="preserve"> }}</w:t>
       </w:r>
       <w:r>
         <w:rPr>
@@ -894,7 +1023,25 @@
           <w:sz w:val="20"/>
           <w:szCs w:val="20"/>
         </w:rPr>
-        <w:t>{% if fta_conditions.arrest_warrant is true %}</w:t>
+        <w:t xml:space="preserve">{% if </w:t>
+      </w:r>
+      <w:proofErr w:type="spellStart"/>
+      <w:r>
+        <w:rPr>
+          <w:rFonts w:ascii="Palatino Linotype" w:hAnsi="Palatino Linotype"/>
+          <w:sz w:val="20"/>
+          <w:szCs w:val="20"/>
+        </w:rPr>
+        <w:t>fta_conditions.arrest_warrant</w:t>
+      </w:r>
+      <w:proofErr w:type="spellEnd"/>
+      <w:r>
+        <w:rPr>
+          <w:rFonts w:ascii="Palatino Linotype" w:hAnsi="Palatino Linotype"/>
+          <w:sz w:val="20"/>
+          <w:szCs w:val="20"/>
+        </w:rPr>
+        <w:t xml:space="preserve"> is true %}</w:t>
       </w:r>
     </w:p>
     <w:p>
@@ -924,6 +1071,7 @@
         </w:rPr>
         <w:t xml:space="preserve">An arrest warrant for the Defendant shall issue forthwith. The pickup radius for the warrant is {{ </w:t>
       </w:r>
+      <w:proofErr w:type="spellStart"/>
       <w:r>
         <w:rPr>
           <w:rFonts w:ascii="Palatino Linotype" w:hAnsi="Palatino Linotype"/>
@@ -938,15 +1086,42 @@
           <w:sz w:val="20"/>
           <w:szCs w:val="20"/>
         </w:rPr>
-        <w:t>arrest_warrant_radius }}. {% endif %}</w:t>
-      </w:r>
-      <w:r>
-        <w:rPr>
-          <w:rFonts w:ascii="Palatino Linotype" w:hAnsi="Palatino Linotype"/>
-          <w:sz w:val="20"/>
-          <w:szCs w:val="20"/>
-        </w:rPr>
-        <w:t>{% if fta_conditions.bond_forfeited %}</w:t>
+        <w:t>arrest_warrant_radius</w:t>
+      </w:r>
+      <w:proofErr w:type="spellEnd"/>
+      <w:r>
+        <w:rPr>
+          <w:rFonts w:ascii="Palatino Linotype" w:hAnsi="Palatino Linotype"/>
+          <w:sz w:val="20"/>
+          <w:szCs w:val="20"/>
+        </w:rPr>
+        <w:t xml:space="preserve"> }}. {% endif %}</w:t>
+      </w:r>
+      <w:r>
+        <w:rPr>
+          <w:rFonts w:ascii="Palatino Linotype" w:hAnsi="Palatino Linotype"/>
+          <w:sz w:val="20"/>
+          <w:szCs w:val="20"/>
+        </w:rPr>
+        <w:t xml:space="preserve">{% if </w:t>
+      </w:r>
+      <w:proofErr w:type="spellStart"/>
+      <w:r>
+        <w:rPr>
+          <w:rFonts w:ascii="Palatino Linotype" w:hAnsi="Palatino Linotype"/>
+          <w:sz w:val="20"/>
+          <w:szCs w:val="20"/>
+        </w:rPr>
+        <w:t>fta_conditions.bond_forfeited</w:t>
+      </w:r>
+      <w:proofErr w:type="spellEnd"/>
+      <w:r>
+        <w:rPr>
+          <w:rFonts w:ascii="Palatino Linotype" w:hAnsi="Palatino Linotype"/>
+          <w:sz w:val="20"/>
+          <w:szCs w:val="20"/>
+        </w:rPr>
+        <w:t xml:space="preserve"> %}</w:t>
       </w:r>
     </w:p>
     <w:p>
@@ -981,7 +1156,25 @@
           <w:sz w:val="20"/>
           <w:szCs w:val="20"/>
         </w:rPr>
-        <w:t>{% if fta_conditions.set_no_trial is true %}</w:t>
+        <w:t xml:space="preserve">{% if </w:t>
+      </w:r>
+      <w:proofErr w:type="spellStart"/>
+      <w:r>
+        <w:rPr>
+          <w:rFonts w:ascii="Palatino Linotype" w:hAnsi="Palatino Linotype"/>
+          <w:sz w:val="20"/>
+          <w:szCs w:val="20"/>
+        </w:rPr>
+        <w:t>fta_conditions.set_no_trial</w:t>
+      </w:r>
+      <w:proofErr w:type="spellEnd"/>
+      <w:r>
+        <w:rPr>
+          <w:rFonts w:ascii="Palatino Linotype" w:hAnsi="Palatino Linotype"/>
+          <w:sz w:val="20"/>
+          <w:szCs w:val="20"/>
+        </w:rPr>
+        <w:t xml:space="preserve"> is true %}</w:t>
       </w:r>
     </w:p>
     <w:p>
@@ -1032,7 +1225,25 @@
           <w:sz w:val="20"/>
           <w:szCs w:val="20"/>
         </w:rPr>
-        <w:t>{% if fta_conditions.surety_appear is true %}</w:t>
+        <w:t xml:space="preserve">{% if </w:t>
+      </w:r>
+      <w:proofErr w:type="spellStart"/>
+      <w:r>
+        <w:rPr>
+          <w:rFonts w:ascii="Palatino Linotype" w:hAnsi="Palatino Linotype"/>
+          <w:sz w:val="20"/>
+          <w:szCs w:val="20"/>
+        </w:rPr>
+        <w:t>fta_conditions.surety_appear</w:t>
+      </w:r>
+      <w:proofErr w:type="spellEnd"/>
+      <w:r>
+        <w:rPr>
+          <w:rFonts w:ascii="Palatino Linotype" w:hAnsi="Palatino Linotype"/>
+          <w:sz w:val="20"/>
+          <w:szCs w:val="20"/>
+        </w:rPr>
+        <w:t xml:space="preserve"> is true %}</w:t>
       </w:r>
     </w:p>
     <w:p>
@@ -1102,7 +1313,23 @@
           <w:sz w:val="20"/>
           <w:szCs w:val="20"/>
         </w:rPr>
-        <w:t xml:space="preserve">ourt. The Clerk of Court is ordered to serve the surety by ordinary mail to address on bond within </w:t>
+        <w:t xml:space="preserve">ourt. The Clerk of Court is ordered to serve the surety by </w:t>
+      </w:r>
+      <w:r>
+        <w:rPr>
+          <w:rFonts w:ascii="Palatino Linotype" w:hAnsi="Palatino Linotype"/>
+          <w:sz w:val="20"/>
+          <w:szCs w:val="20"/>
+        </w:rPr>
+        <w:t xml:space="preserve">certified and </w:t>
+      </w:r>
+      <w:r>
+        <w:rPr>
+          <w:rFonts w:ascii="Palatino Linotype" w:hAnsi="Palatino Linotype"/>
+          <w:sz w:val="20"/>
+          <w:szCs w:val="20"/>
+        </w:rPr>
+        <w:t xml:space="preserve">ordinary mail to address on bond within </w:t>
       </w:r>
       <w:r>
         <w:rPr>
@@ -1118,7 +1345,25 @@
           <w:sz w:val="20"/>
           <w:szCs w:val="20"/>
         </w:rPr>
-        <w:t>{% if fta_conditions.forfeit_license is true %}</w:t>
+        <w:t xml:space="preserve">{% if </w:t>
+      </w:r>
+      <w:proofErr w:type="spellStart"/>
+      <w:r>
+        <w:rPr>
+          <w:rFonts w:ascii="Palatino Linotype" w:hAnsi="Palatino Linotype"/>
+          <w:sz w:val="20"/>
+          <w:szCs w:val="20"/>
+        </w:rPr>
+        <w:t>fta_conditions.forfeit_license</w:t>
+      </w:r>
+      <w:proofErr w:type="spellEnd"/>
+      <w:r>
+        <w:rPr>
+          <w:rFonts w:ascii="Palatino Linotype" w:hAnsi="Palatino Linotype"/>
+          <w:sz w:val="20"/>
+          <w:szCs w:val="20"/>
+        </w:rPr>
+        <w:t xml:space="preserve"> is true %}</w:t>
       </w:r>
     </w:p>
     <w:p>
@@ -1187,7 +1432,25 @@
           <w:sz w:val="20"/>
           <w:szCs w:val="20"/>
         </w:rPr>
-        <w:t>{% if fta_conditions.non_resident_license is true %}</w:t>
+        <w:t xml:space="preserve">{% if </w:t>
+      </w:r>
+      <w:proofErr w:type="spellStart"/>
+      <w:r>
+        <w:rPr>
+          <w:rFonts w:ascii="Palatino Linotype" w:hAnsi="Palatino Linotype"/>
+          <w:sz w:val="20"/>
+          <w:szCs w:val="20"/>
+        </w:rPr>
+        <w:t>fta_conditions.non_resident_license</w:t>
+      </w:r>
+      <w:proofErr w:type="spellEnd"/>
+      <w:r>
+        <w:rPr>
+          <w:rFonts w:ascii="Palatino Linotype" w:hAnsi="Palatino Linotype"/>
+          <w:sz w:val="20"/>
+          <w:szCs w:val="20"/>
+        </w:rPr>
+        <w:t xml:space="preserve"> is true %}</w:t>
       </w:r>
     </w:p>
     <w:p>
@@ -1248,7 +1511,25 @@
           <w:sz w:val="20"/>
           <w:szCs w:val="20"/>
         </w:rPr>
-        <w:t>{% if fta_conditions.supplemental_summons is true %}</w:t>
+        <w:t xml:space="preserve">{% if </w:t>
+      </w:r>
+      <w:proofErr w:type="spellStart"/>
+      <w:r>
+        <w:rPr>
+          <w:rFonts w:ascii="Palatino Linotype" w:hAnsi="Palatino Linotype"/>
+          <w:sz w:val="20"/>
+          <w:szCs w:val="20"/>
+        </w:rPr>
+        <w:t>fta_conditions.supplemental_summons</w:t>
+      </w:r>
+      <w:proofErr w:type="spellEnd"/>
+      <w:r>
+        <w:rPr>
+          <w:rFonts w:ascii="Palatino Linotype" w:hAnsi="Palatino Linotype"/>
+          <w:sz w:val="20"/>
+          <w:szCs w:val="20"/>
+        </w:rPr>
+        <w:t xml:space="preserve"> is true %}</w:t>
       </w:r>
     </w:p>
     <w:p>
@@ -1275,7 +1556,25 @@
           <w:sz w:val="20"/>
           <w:szCs w:val="20"/>
         </w:rPr>
-        <w:t>The Clerk shall issue a supplemental summons to the Defendant by regular mail. {% endif %}{% if fta_conditions.proof_of_service %}</w:t>
+        <w:t xml:space="preserve">The Clerk shall issue a supplemental summons to the Defendant by regular mail. {% endif %}{% if </w:t>
+      </w:r>
+      <w:proofErr w:type="spellStart"/>
+      <w:r>
+        <w:rPr>
+          <w:rFonts w:ascii="Palatino Linotype" w:hAnsi="Palatino Linotype"/>
+          <w:sz w:val="20"/>
+          <w:szCs w:val="20"/>
+        </w:rPr>
+        <w:t>fta_conditions.proof_of_service</w:t>
+      </w:r>
+      <w:proofErr w:type="spellEnd"/>
+      <w:r>
+        <w:rPr>
+          <w:rFonts w:ascii="Palatino Linotype" w:hAnsi="Palatino Linotype"/>
+          <w:sz w:val="20"/>
+          <w:szCs w:val="20"/>
+        </w:rPr>
+        <w:t xml:space="preserve"> %}</w:t>
       </w:r>
     </w:p>
     <w:p>
@@ -1318,7 +1617,25 @@
           <w:sz w:val="20"/>
           <w:szCs w:val="20"/>
         </w:rPr>
-        <w:t xml:space="preserve"> {% endif %}{% if fta_conditions.registration_block is true %}</w:t>
+        <w:t xml:space="preserve"> {% endif %}{% if </w:t>
+      </w:r>
+      <w:proofErr w:type="spellStart"/>
+      <w:r>
+        <w:rPr>
+          <w:rFonts w:ascii="Palatino Linotype" w:hAnsi="Palatino Linotype"/>
+          <w:sz w:val="20"/>
+          <w:szCs w:val="20"/>
+        </w:rPr>
+        <w:t>fta_conditions.registration_block</w:t>
+      </w:r>
+      <w:proofErr w:type="spellEnd"/>
+      <w:r>
+        <w:rPr>
+          <w:rFonts w:ascii="Palatino Linotype" w:hAnsi="Palatino Linotype"/>
+          <w:sz w:val="20"/>
+          <w:szCs w:val="20"/>
+        </w:rPr>
+        <w:t xml:space="preserve"> is true %}</w:t>
       </w:r>
     </w:p>
     <w:p>
@@ -1391,7 +1708,27 @@
           <w:sz w:val="20"/>
           <w:szCs w:val="20"/>
         </w:rPr>
-        <w:t>{% if fta_conditions.set_bond is true %}</w:t>
+        <w:t xml:space="preserve">{% if </w:t>
+      </w:r>
+      <w:proofErr w:type="spellStart"/>
+      <w:r>
+        <w:rPr>
+          <w:rFonts w:ascii="Palatino Linotype" w:hAnsi="Palatino Linotype"/>
+          <w:bCs/>
+          <w:sz w:val="20"/>
+          <w:szCs w:val="20"/>
+        </w:rPr>
+        <w:t>fta_conditions.set_bond</w:t>
+      </w:r>
+      <w:proofErr w:type="spellEnd"/>
+      <w:r>
+        <w:rPr>
+          <w:rFonts w:ascii="Palatino Linotype" w:hAnsi="Palatino Linotype"/>
+          <w:bCs/>
+          <w:sz w:val="20"/>
+          <w:szCs w:val="20"/>
+        </w:rPr>
+        <w:t xml:space="preserve"> is true %}</w:t>
       </w:r>
       <w:r>
         <w:rPr>
@@ -1439,7 +1776,27 @@
           <w:sz w:val="20"/>
           <w:szCs w:val="20"/>
         </w:rPr>
-        <w:t xml:space="preserve">{% if fta_conditions.bond_type == ‘No Bond’ %}Upon apprehension or appearance, Defendant shall be held </w:t>
+        <w:t xml:space="preserve">{% if </w:t>
+      </w:r>
+      <w:proofErr w:type="spellStart"/>
+      <w:r>
+        <w:rPr>
+          <w:rFonts w:ascii="Palatino Linotype" w:hAnsi="Palatino Linotype"/>
+          <w:bCs/>
+          <w:sz w:val="20"/>
+          <w:szCs w:val="20"/>
+        </w:rPr>
+        <w:t>fta_conditions.bond_type</w:t>
+      </w:r>
+      <w:proofErr w:type="spellEnd"/>
+      <w:r>
+        <w:rPr>
+          <w:rFonts w:ascii="Palatino Linotype" w:hAnsi="Palatino Linotype"/>
+          <w:bCs/>
+          <w:sz w:val="20"/>
+          <w:szCs w:val="20"/>
+        </w:rPr>
+        <w:t xml:space="preserve"> == ‘No Bond’ %}Upon apprehension or appearance, Defendant shall be held </w:t>
       </w:r>
       <w:r>
         <w:rPr>
@@ -1458,16 +1815,96 @@
           <w:sz w:val="20"/>
           <w:szCs w:val="20"/>
         </w:rPr>
-        <w:t xml:space="preserve">{% elif fta_conditions.bond_type == ‘Recognizance (OR) Bond’ %}Upon apprehension or appearance, Defendant may execute a Personal Recognizance Bond to ensure future appearance. </w:t>
-      </w:r>
-      <w:r>
-        <w:rPr>
-          <w:rFonts w:ascii="Palatino Linotype" w:hAnsi="Palatino Linotype"/>
-          <w:bCs/>
-          <w:sz w:val="20"/>
-          <w:szCs w:val="20"/>
-        </w:rPr>
-        <w:t xml:space="preserve">{% elif fta_conditions.bond_type </w:t>
+        <w:t xml:space="preserve">{% </w:t>
+      </w:r>
+      <w:proofErr w:type="spellStart"/>
+      <w:r>
+        <w:rPr>
+          <w:rFonts w:ascii="Palatino Linotype" w:hAnsi="Palatino Linotype"/>
+          <w:bCs/>
+          <w:sz w:val="20"/>
+          <w:szCs w:val="20"/>
+        </w:rPr>
+        <w:t>elif</w:t>
+      </w:r>
+      <w:proofErr w:type="spellEnd"/>
+      <w:r>
+        <w:rPr>
+          <w:rFonts w:ascii="Palatino Linotype" w:hAnsi="Palatino Linotype"/>
+          <w:bCs/>
+          <w:sz w:val="20"/>
+          <w:szCs w:val="20"/>
+        </w:rPr>
+        <w:t xml:space="preserve"> </w:t>
+      </w:r>
+      <w:proofErr w:type="spellStart"/>
+      <w:r>
+        <w:rPr>
+          <w:rFonts w:ascii="Palatino Linotype" w:hAnsi="Palatino Linotype"/>
+          <w:bCs/>
+          <w:sz w:val="20"/>
+          <w:szCs w:val="20"/>
+        </w:rPr>
+        <w:t>fta_conditions.bond_type</w:t>
+      </w:r>
+      <w:proofErr w:type="spellEnd"/>
+      <w:r>
+        <w:rPr>
+          <w:rFonts w:ascii="Palatino Linotype" w:hAnsi="Palatino Linotype"/>
+          <w:bCs/>
+          <w:sz w:val="20"/>
+          <w:szCs w:val="20"/>
+        </w:rPr>
+        <w:t xml:space="preserve"> == ‘Recognizance (OR) Bond’ %}Upon apprehension or appearance, Defendant may execute a Personal Recognizance Bond to ensure future appearance. </w:t>
+      </w:r>
+      <w:r>
+        <w:rPr>
+          <w:rFonts w:ascii="Palatino Linotype" w:hAnsi="Palatino Linotype"/>
+          <w:bCs/>
+          <w:sz w:val="20"/>
+          <w:szCs w:val="20"/>
+        </w:rPr>
+        <w:t xml:space="preserve">{% </w:t>
+      </w:r>
+      <w:proofErr w:type="spellStart"/>
+      <w:r>
+        <w:rPr>
+          <w:rFonts w:ascii="Palatino Linotype" w:hAnsi="Palatino Linotype"/>
+          <w:bCs/>
+          <w:sz w:val="20"/>
+          <w:szCs w:val="20"/>
+        </w:rPr>
+        <w:t>elif</w:t>
+      </w:r>
+      <w:proofErr w:type="spellEnd"/>
+      <w:r>
+        <w:rPr>
+          <w:rFonts w:ascii="Palatino Linotype" w:hAnsi="Palatino Linotype"/>
+          <w:bCs/>
+          <w:sz w:val="20"/>
+          <w:szCs w:val="20"/>
+        </w:rPr>
+        <w:t xml:space="preserve"> </w:t>
+      </w:r>
+      <w:proofErr w:type="spellStart"/>
+      <w:r>
+        <w:rPr>
+          <w:rFonts w:ascii="Palatino Linotype" w:hAnsi="Palatino Linotype"/>
+          <w:bCs/>
+          <w:sz w:val="20"/>
+          <w:szCs w:val="20"/>
+        </w:rPr>
+        <w:t>fta_conditions.bond_type</w:t>
+      </w:r>
+      <w:proofErr w:type="spellEnd"/>
+      <w:r>
+        <w:rPr>
+          <w:rFonts w:ascii="Palatino Linotype" w:hAnsi="Palatino Linotype"/>
+          <w:bCs/>
+          <w:sz w:val="20"/>
+          <w:szCs w:val="20"/>
+        </w:rPr>
+        <w:t xml:space="preserve"> </w:t>
       </w:r>
       <w:r>
         <w:rPr>
@@ -1548,7 +1985,47 @@
           <w:sz w:val="20"/>
           <w:szCs w:val="20"/>
         </w:rPr>
-        <w:t>he bond set for the Defendant is a {{ fta_conditions.bond_type }} in the amount of {{ fta_conditions.bond_amount }}. {% endif %}</w:t>
+        <w:t xml:space="preserve">he bond set for the Defendant is a {{ </w:t>
+      </w:r>
+      <w:proofErr w:type="spellStart"/>
+      <w:r>
+        <w:rPr>
+          <w:rFonts w:ascii="Palatino Linotype" w:hAnsi="Palatino Linotype"/>
+          <w:bCs/>
+          <w:sz w:val="20"/>
+          <w:szCs w:val="20"/>
+        </w:rPr>
+        <w:t>fta_conditions.bond_type</w:t>
+      </w:r>
+      <w:proofErr w:type="spellEnd"/>
+      <w:r>
+        <w:rPr>
+          <w:rFonts w:ascii="Palatino Linotype" w:hAnsi="Palatino Linotype"/>
+          <w:bCs/>
+          <w:sz w:val="20"/>
+          <w:szCs w:val="20"/>
+        </w:rPr>
+        <w:t xml:space="preserve"> }} in the amount of {{ </w:t>
+      </w:r>
+      <w:proofErr w:type="spellStart"/>
+      <w:r>
+        <w:rPr>
+          <w:rFonts w:ascii="Palatino Linotype" w:hAnsi="Palatino Linotype"/>
+          <w:bCs/>
+          <w:sz w:val="20"/>
+          <w:szCs w:val="20"/>
+        </w:rPr>
+        <w:t>fta_conditions.bond_amount</w:t>
+      </w:r>
+      <w:proofErr w:type="spellEnd"/>
+      <w:r>
+        <w:rPr>
+          <w:rFonts w:ascii="Palatino Linotype" w:hAnsi="Palatino Linotype"/>
+          <w:bCs/>
+          <w:sz w:val="20"/>
+          <w:szCs w:val="20"/>
+        </w:rPr>
+        <w:t xml:space="preserve"> }}. {% endif %}</w:t>
       </w:r>
     </w:p>
     <w:p>
@@ -1585,7 +2062,27 @@
           <w:sz w:val="20"/>
           <w:szCs w:val="20"/>
         </w:rPr>
-        <w:t>{% if fta_conditions.bond_type != ‘No Bond’ %}If the Defendant executes a bond as permitted by this order, Defendant shall comply with the following conditions:</w:t>
+        <w:t xml:space="preserve">{% if </w:t>
+      </w:r>
+      <w:proofErr w:type="spellStart"/>
+      <w:r>
+        <w:rPr>
+          <w:rFonts w:ascii="Palatino Linotype" w:hAnsi="Palatino Linotype"/>
+          <w:bCs/>
+          <w:sz w:val="20"/>
+          <w:szCs w:val="20"/>
+        </w:rPr>
+        <w:t>fta_conditions.bond_type</w:t>
+      </w:r>
+      <w:proofErr w:type="spellEnd"/>
+      <w:r>
+        <w:rPr>
+          <w:rFonts w:ascii="Palatino Linotype" w:hAnsi="Palatino Linotype"/>
+          <w:bCs/>
+          <w:sz w:val="20"/>
+          <w:szCs w:val="20"/>
+        </w:rPr>
+        <w:t xml:space="preserve"> != ‘No Bond’ %}If the Defendant executes a bond as permitted by this order, Defendant shall comply with the following conditions:</w:t>
       </w:r>
     </w:p>
     <w:p>
@@ -1873,23 +2370,50 @@
           <w:sz w:val="20"/>
           <w:szCs w:val="20"/>
         </w:rPr>
-        <w:t>{{ judicial_officer.officer_</w:t>
-      </w:r>
-      <w:r>
-        <w:rPr>
-          <w:rFonts w:ascii="Palatino Linotype" w:hAnsi="Palatino Linotype"/>
-          <w:sz w:val="20"/>
-          <w:szCs w:val="20"/>
-        </w:rPr>
-        <w:t xml:space="preserve">type }} </w:t>
-      </w:r>
-      <w:r>
-        <w:rPr>
-          <w:rFonts w:ascii="Palatino Linotype" w:hAnsi="Palatino Linotype"/>
-          <w:sz w:val="20"/>
-          <w:szCs w:val="20"/>
-        </w:rPr>
-        <w:t>{{ judicial_officer</w:t>
+        <w:t xml:space="preserve">{{ </w:t>
+      </w:r>
+      <w:proofErr w:type="spellStart"/>
+      <w:r>
+        <w:rPr>
+          <w:rFonts w:ascii="Palatino Linotype" w:hAnsi="Palatino Linotype"/>
+          <w:sz w:val="20"/>
+          <w:szCs w:val="20"/>
+        </w:rPr>
+        <w:t>judicial_officer.officer_</w:t>
+      </w:r>
+      <w:r>
+        <w:rPr>
+          <w:rFonts w:ascii="Palatino Linotype" w:hAnsi="Palatino Linotype"/>
+          <w:sz w:val="20"/>
+          <w:szCs w:val="20"/>
+        </w:rPr>
+        <w:t>type</w:t>
+      </w:r>
+      <w:proofErr w:type="spellEnd"/>
+      <w:r>
+        <w:rPr>
+          <w:rFonts w:ascii="Palatino Linotype" w:hAnsi="Palatino Linotype"/>
+          <w:sz w:val="20"/>
+          <w:szCs w:val="20"/>
+        </w:rPr>
+        <w:t xml:space="preserve"> }} </w:t>
+      </w:r>
+      <w:r>
+        <w:rPr>
+          <w:rFonts w:ascii="Palatino Linotype" w:hAnsi="Palatino Linotype"/>
+          <w:sz w:val="20"/>
+          <w:szCs w:val="20"/>
+        </w:rPr>
+        <w:t xml:space="preserve">{{ </w:t>
+      </w:r>
+      <w:proofErr w:type="spellStart"/>
+      <w:r>
+        <w:rPr>
+          <w:rFonts w:ascii="Palatino Linotype" w:hAnsi="Palatino Linotype"/>
+          <w:sz w:val="20"/>
+          <w:szCs w:val="20"/>
+        </w:rPr>
+        <w:t>judicial_officer</w:t>
       </w:r>
       <w:r>
         <w:rPr>
@@ -1899,6 +2423,7 @@
         </w:rPr>
         <w:t>.first_name</w:t>
       </w:r>
+      <w:proofErr w:type="spellEnd"/>
       <w:r>
         <w:rPr>
           <w:rFonts w:ascii="Palatino Linotype" w:hAnsi="Palatino Linotype"/>
@@ -1921,7 +2446,25 @@
           <w:sz w:val="20"/>
           <w:szCs w:val="20"/>
         </w:rPr>
-        <w:t>{{ judicial_officer.last_name }}</w:t>
+        <w:t xml:space="preserve">{{ </w:t>
+      </w:r>
+      <w:proofErr w:type="spellStart"/>
+      <w:r>
+        <w:rPr>
+          <w:rFonts w:ascii="Palatino Linotype" w:hAnsi="Palatino Linotype"/>
+          <w:sz w:val="20"/>
+          <w:szCs w:val="20"/>
+        </w:rPr>
+        <w:t>judicial_officer.last_name</w:t>
+      </w:r>
+      <w:proofErr w:type="spellEnd"/>
+      <w:r>
+        <w:rPr>
+          <w:rFonts w:ascii="Palatino Linotype" w:hAnsi="Palatino Linotype"/>
+          <w:sz w:val="20"/>
+          <w:szCs w:val="20"/>
+        </w:rPr>
+        <w:t xml:space="preserve"> }}</w:t>
       </w:r>
     </w:p>
     <w:p>
@@ -1984,8 +2527,9 @@
           <w:sz w:val="20"/>
           <w:szCs w:val="20"/>
         </w:rPr>
-        <w:t>% if judicial_of</w:t>
-      </w:r>
+        <w:t xml:space="preserve">% if </w:t>
+      </w:r>
+      <w:proofErr w:type="spellStart"/>
       <w:r>
         <w:rPr>
           <w:rFonts w:ascii="Palatino Linotype" w:hAnsi="Palatino Linotype"/>
@@ -1994,6 +2538,16 @@
           <w:sz w:val="20"/>
           <w:szCs w:val="20"/>
         </w:rPr>
+        <w:t>judicial_of</w:t>
+      </w:r>
+      <w:r>
+        <w:rPr>
+          <w:rFonts w:ascii="Palatino Linotype" w:hAnsi="Palatino Linotype"/>
+          <w:bCs/>
+          <w:color w:val="FF0000"/>
+          <w:sz w:val="20"/>
+          <w:szCs w:val="20"/>
+        </w:rPr>
         <w:t>ficer</w:t>
       </w:r>
       <w:r>
@@ -2014,7 +2568,18 @@
           <w:sz w:val="20"/>
           <w:szCs w:val="20"/>
         </w:rPr>
-        <w:t>_type  ==  ‘Magistrate’ %}</w:t>
+        <w:t>_type</w:t>
+      </w:r>
+      <w:proofErr w:type="spellEnd"/>
+      <w:r>
+        <w:rPr>
+          <w:rFonts w:ascii="Palatino Linotype" w:hAnsi="Palatino Linotype"/>
+          <w:bCs/>
+          <w:color w:val="FF0000"/>
+          <w:sz w:val="20"/>
+          <w:szCs w:val="20"/>
+        </w:rPr>
+        <w:t xml:space="preserve">  ==  ‘Magistrate’ %}</w:t>
       </w:r>
     </w:p>
     <w:p>
@@ -2174,7 +2739,43 @@
           <w:sz w:val="16"/>
           <w:szCs w:val="16"/>
         </w:rPr>
-        <w:t>Prosecutor’s Office: PS    OM     EM; Defendant’s Attorney: PS     OM     EM; {{ defendant.first_name }} {{ defendant.last_name}}: PS     OM     EM; Community Control: PS    EM; County Jail: PS   EM;</w:t>
+        <w:t xml:space="preserve">Prosecutor’s Office: PS    OM     EM; Defendant’s Attorney: PS     OM     EM; {{ </w:t>
+      </w:r>
+      <w:proofErr w:type="spellStart"/>
+      <w:r>
+        <w:rPr>
+          <w:rFonts w:ascii="Palatino Linotype" w:hAnsi="Palatino Linotype"/>
+          <w:sz w:val="16"/>
+          <w:szCs w:val="16"/>
+        </w:rPr>
+        <w:t>defendant.first_name</w:t>
+      </w:r>
+      <w:proofErr w:type="spellEnd"/>
+      <w:r>
+        <w:rPr>
+          <w:rFonts w:ascii="Palatino Linotype" w:hAnsi="Palatino Linotype"/>
+          <w:sz w:val="16"/>
+          <w:szCs w:val="16"/>
+        </w:rPr>
+        <w:t xml:space="preserve"> }} {{ </w:t>
+      </w:r>
+      <w:proofErr w:type="spellStart"/>
+      <w:r>
+        <w:rPr>
+          <w:rFonts w:ascii="Palatino Linotype" w:hAnsi="Palatino Linotype"/>
+          <w:sz w:val="16"/>
+          <w:szCs w:val="16"/>
+        </w:rPr>
+        <w:t>defendant.last_name</w:t>
+      </w:r>
+      <w:proofErr w:type="spellEnd"/>
+      <w:r>
+        <w:rPr>
+          <w:rFonts w:ascii="Palatino Linotype" w:hAnsi="Palatino Linotype"/>
+          <w:sz w:val="16"/>
+          <w:szCs w:val="16"/>
+        </w:rPr>
+        <w:t>}}: PS     OM     EM; Community Control: PS    EM; County Jail: PS   EM;</w:t>
       </w:r>
     </w:p>
     <w:p>
@@ -2203,7 +2804,7 @@
           <w:sz w:val="16"/>
           <w:szCs w:val="16"/>
         </w:rPr>
-        <w:t>{% if fta_conditions.surety_appear is true %}</w:t>
+        <w:t>Surety: OM</w:t>
       </w:r>
       <w:r>
         <w:rPr>
@@ -2211,7 +2812,8 @@
           <w:sz w:val="16"/>
           <w:szCs w:val="16"/>
         </w:rPr>
-        <w:t>Surety: OM</w:t>
+        <w:tab/>
+        <w:t>PS;</w:t>
       </w:r>
       <w:r>
         <w:rPr>
@@ -2219,16 +2821,24 @@
           <w:sz w:val="16"/>
           <w:szCs w:val="16"/>
         </w:rPr>
+        <w:t xml:space="preserve"> </w:t>
+      </w:r>
+      <w:r>
+        <w:rPr>
+          <w:rFonts w:ascii="Palatino Linotype" w:hAnsi="Palatino Linotype"/>
+          <w:sz w:val="16"/>
+          <w:szCs w:val="16"/>
+        </w:rPr>
+        <w:t>Surety Insurance Company: OM</w:t>
+      </w:r>
+      <w:r>
+        <w:rPr>
+          <w:rFonts w:ascii="Palatino Linotype" w:hAnsi="Palatino Linotype"/>
+          <w:sz w:val="16"/>
+          <w:szCs w:val="16"/>
+        </w:rPr>
         <w:tab/>
         <w:t>PS;</w:t>
-      </w:r>
-      <w:r>
-        <w:rPr>
-          <w:rFonts w:ascii="Palatino Linotype" w:hAnsi="Palatino Linotype"/>
-          <w:sz w:val="16"/>
-          <w:szCs w:val="16"/>
-        </w:rPr>
-        <w:t xml:space="preserve"> {% endif %}</w:t>
       </w:r>
     </w:p>
     <w:sectPr>
@@ -2445,8 +3055,9 @@
         <w:sz w:val="20"/>
         <w:szCs w:val="20"/>
       </w:rPr>
-      <w:t xml:space="preserve">% if judicial_officer.officer_type  ==  ‘Magistrate’ %}Magistrate Decision – </w:t>
+      <w:t xml:space="preserve">% if </w:t>
     </w:r>
+    <w:proofErr w:type="spellStart"/>
     <w:r>
       <w:rPr>
         <w:rFonts w:ascii="Palatino Linotype" w:hAnsi="Palatino Linotype"/>
@@ -2454,8 +3065,9 @@
         <w:sz w:val="20"/>
         <w:szCs w:val="20"/>
       </w:rPr>
-      <w:t>Failure To Appear</w:t>
+      <w:t>judicial_officer.officer_type</w:t>
     </w:r>
+    <w:proofErr w:type="spellEnd"/>
     <w:r>
       <w:rPr>
         <w:rFonts w:ascii="Palatino Linotype" w:hAnsi="Palatino Linotype"/>
@@ -2463,6 +3075,24 @@
         <w:sz w:val="20"/>
         <w:szCs w:val="20"/>
       </w:rPr>
+      <w:t xml:space="preserve">  ==  ‘Magistrate’ %}Magistrate Decision – </w:t>
+    </w:r>
+    <w:r>
+      <w:rPr>
+        <w:rFonts w:ascii="Palatino Linotype" w:hAnsi="Palatino Linotype"/>
+        <w:bCs/>
+        <w:sz w:val="20"/>
+        <w:szCs w:val="20"/>
+      </w:rPr>
+      <w:t>Failure To Appear</w:t>
+    </w:r>
+    <w:r>
+      <w:rPr>
+        <w:rFonts w:ascii="Palatino Linotype" w:hAnsi="Palatino Linotype"/>
+        <w:bCs/>
+        <w:sz w:val="20"/>
+        <w:szCs w:val="20"/>
+      </w:rPr>
       <w:t xml:space="preserve"> Entry</w:t>
     </w:r>
     <w:r>
@@ -2471,14 +3101,50 @@
         <w:sz w:val="20"/>
         <w:szCs w:val="20"/>
       </w:rPr>
-      <w:t>{% elif judicial_officer.officer_type == ‘Judge’ %}</w:t>
+      <w:t xml:space="preserve">{% </w:t>
     </w:r>
+    <w:proofErr w:type="spellStart"/>
     <w:r>
       <w:rPr>
         <w:rFonts w:ascii="Palatino Linotype" w:hAnsi="Palatino Linotype"/>
         <w:sz w:val="20"/>
         <w:szCs w:val="20"/>
       </w:rPr>
+      <w:t>elif</w:t>
+    </w:r>
+    <w:proofErr w:type="spellEnd"/>
+    <w:r>
+      <w:rPr>
+        <w:rFonts w:ascii="Palatino Linotype" w:hAnsi="Palatino Linotype"/>
+        <w:sz w:val="20"/>
+        <w:szCs w:val="20"/>
+      </w:rPr>
+      <w:t xml:space="preserve"> </w:t>
+    </w:r>
+    <w:proofErr w:type="spellStart"/>
+    <w:r>
+      <w:rPr>
+        <w:rFonts w:ascii="Palatino Linotype" w:hAnsi="Palatino Linotype"/>
+        <w:sz w:val="20"/>
+        <w:szCs w:val="20"/>
+      </w:rPr>
+      <w:t>judicial_officer.officer_type</w:t>
+    </w:r>
+    <w:proofErr w:type="spellEnd"/>
+    <w:r>
+      <w:rPr>
+        <w:rFonts w:ascii="Palatino Linotype" w:hAnsi="Palatino Linotype"/>
+        <w:sz w:val="20"/>
+        <w:szCs w:val="20"/>
+      </w:rPr>
+      <w:t xml:space="preserve"> == ‘Judge’ %}</w:t>
+    </w:r>
+    <w:r>
+      <w:rPr>
+        <w:rFonts w:ascii="Palatino Linotype" w:hAnsi="Palatino Linotype"/>
+        <w:sz w:val="20"/>
+        <w:szCs w:val="20"/>
+      </w:rPr>
       <w:t>Failure To Appear</w:t>
     </w:r>
     <w:r>
@@ -2487,7 +3153,25 @@
         <w:sz w:val="20"/>
         <w:szCs w:val="20"/>
       </w:rPr>
-      <w:t xml:space="preserve"> Judgment Entry{% endif %} {{ case_number </w:t>
+      <w:t xml:space="preserve"> Judgment Entry{% endif %} {{ </w:t>
+    </w:r>
+    <w:proofErr w:type="spellStart"/>
+    <w:r>
+      <w:rPr>
+        <w:rFonts w:ascii="Palatino Linotype" w:hAnsi="Palatino Linotype"/>
+        <w:sz w:val="20"/>
+        <w:szCs w:val="20"/>
+      </w:rPr>
+      <w:t>case_number</w:t>
+    </w:r>
+    <w:proofErr w:type="spellEnd"/>
+    <w:r>
+      <w:rPr>
+        <w:rFonts w:ascii="Palatino Linotype" w:hAnsi="Palatino Linotype"/>
+        <w:sz w:val="20"/>
+        <w:szCs w:val="20"/>
+      </w:rPr>
+      <w:t xml:space="preserve"> </w:t>
     </w:r>
     <w:r>
       <w:rPr>

</xml_diff>